<commit_message>
Fix standardization to POC only.
</commit_message>
<xml_diff>
--- a/recruitment/figs/q2_table.docx
+++ b/recruitment/figs/q2_table.docx
@@ -2790,55 +2790,55 @@
                 <w:rFonts w:ascii="Calibri" w:hAnsi="Calibri"/>
                 <w:sz w:val="20"/>
               </w:rPr>
-              <w:t xml:space="default">-6.82</w:t>
-            </w:r>
-          </w:p>
-        </w:tc>
-        <w:tc>
-          <w:tcPr>
-            <w:tcBorders>
-              <w:top w:val="single" w:space="0" w:color="D3D3D3"/>
-              <w:bottom w:val="single" w:space="0" w:color="D3D3D3"/>
-              <w:start w:val="single" w:space="0" w:color="D3D3D3"/>
-              <w:end w:val="single" w:space="0" w:color="D3D3D3"/>
-            </w:tcBorders>
-          </w:tcPr>
-          <w:p>
-            <w:pPr>
-              <w:spacing w:before="0" w:after="60"/>
-              <w:keepNext/>
-              <w:jc w:val="end"/>
-            </w:pPr>
-            <w:r>
-              <w:rPr>
-                <w:rFonts w:ascii="Calibri" w:hAnsi="Calibri"/>
-                <w:sz w:val="20"/>
-              </w:rPr>
-              <w:t xml:space="default">2.97</w:t>
-            </w:r>
-          </w:p>
-        </w:tc>
-        <w:tc>
-          <w:tcPr>
-            <w:tcBorders>
-              <w:top w:val="single" w:space="0" w:color="D3D3D3"/>
-              <w:bottom w:val="single" w:space="0" w:color="D3D3D3"/>
-              <w:start w:val="single" w:space="0" w:color="D3D3D3"/>
-              <w:end w:val="single" w:space="0" w:color="D3D3D3"/>
-            </w:tcBorders>
-          </w:tcPr>
-          <w:p>
-            <w:pPr>
-              <w:spacing w:before="0" w:after="60"/>
-              <w:keepNext/>
-              <w:jc w:val="end"/>
-            </w:pPr>
-            <w:r>
-              <w:rPr>
-                <w:rFonts w:ascii="Calibri" w:hAnsi="Calibri"/>
-                <w:sz w:val="20"/>
-              </w:rPr>
-              <w:t xml:space="default">0.022</w:t>
+              <w:t xml:space="default">-6.84</w:t>
+            </w:r>
+          </w:p>
+        </w:tc>
+        <w:tc>
+          <w:tcPr>
+            <w:tcBorders>
+              <w:top w:val="single" w:space="0" w:color="D3D3D3"/>
+              <w:bottom w:val="single" w:space="0" w:color="D3D3D3"/>
+              <w:start w:val="single" w:space="0" w:color="D3D3D3"/>
+              <w:end w:val="single" w:space="0" w:color="D3D3D3"/>
+            </w:tcBorders>
+          </w:tcPr>
+          <w:p>
+            <w:pPr>
+              <w:spacing w:before="0" w:after="60"/>
+              <w:keepNext/>
+              <w:jc w:val="end"/>
+            </w:pPr>
+            <w:r>
+              <w:rPr>
+                <w:rFonts w:ascii="Calibri" w:hAnsi="Calibri"/>
+                <w:sz w:val="20"/>
+              </w:rPr>
+              <w:t xml:space="default">3.01</w:t>
+            </w:r>
+          </w:p>
+        </w:tc>
+        <w:tc>
+          <w:tcPr>
+            <w:tcBorders>
+              <w:top w:val="single" w:space="0" w:color="D3D3D3"/>
+              <w:bottom w:val="single" w:space="0" w:color="D3D3D3"/>
+              <w:start w:val="single" w:space="0" w:color="D3D3D3"/>
+              <w:end w:val="single" w:space="0" w:color="D3D3D3"/>
+            </w:tcBorders>
+          </w:tcPr>
+          <w:p>
+            <w:pPr>
+              <w:spacing w:before="0" w:after="60"/>
+              <w:keepNext/>
+              <w:jc w:val="end"/>
+            </w:pPr>
+            <w:r>
+              <w:rPr>
+                <w:rFonts w:ascii="Calibri" w:hAnsi="Calibri"/>
+                <w:sz w:val="20"/>
+              </w:rPr>
+              <w:t xml:space="default">0.023</w:t>
             </w:r>
           </w:p>
         </w:tc>
@@ -2940,31 +2940,31 @@
                 <w:rFonts w:ascii="Calibri" w:hAnsi="Calibri"/>
                 <w:sz w:val="20"/>
               </w:rPr>
-              <w:t xml:space="default">-10.04</w:t>
-            </w:r>
-          </w:p>
-        </w:tc>
-        <w:tc>
-          <w:tcPr>
-            <w:tcBorders>
-              <w:top w:val="single" w:space="0" w:color="D3D3D3"/>
-              <w:bottom w:val="single" w:space="0" w:color="D3D3D3"/>
-              <w:start w:val="single" w:space="0" w:color="D3D3D3"/>
-              <w:end w:val="single" w:space="0" w:color="D3D3D3"/>
-            </w:tcBorders>
-          </w:tcPr>
-          <w:p>
-            <w:pPr>
-              <w:spacing w:before="0" w:after="60"/>
-              <w:keepNext/>
-              <w:jc w:val="end"/>
-            </w:pPr>
-            <w:r>
-              <w:rPr>
-                <w:rFonts w:ascii="Calibri" w:hAnsi="Calibri"/>
-                <w:sz w:val="20"/>
-              </w:rPr>
-              <w:t xml:space="default">3.70</w:t>
+              <w:t xml:space="default">-10.06</w:t>
+            </w:r>
+          </w:p>
+        </w:tc>
+        <w:tc>
+          <w:tcPr>
+            <w:tcBorders>
+              <w:top w:val="single" w:space="0" w:color="D3D3D3"/>
+              <w:bottom w:val="single" w:space="0" w:color="D3D3D3"/>
+              <w:start w:val="single" w:space="0" w:color="D3D3D3"/>
+              <w:end w:val="single" w:space="0" w:color="D3D3D3"/>
+            </w:tcBorders>
+          </w:tcPr>
+          <w:p>
+            <w:pPr>
+              <w:spacing w:before="0" w:after="60"/>
+              <w:keepNext/>
+              <w:jc w:val="end"/>
+            </w:pPr>
+            <w:r>
+              <w:rPr>
+                <w:rFonts w:ascii="Calibri" w:hAnsi="Calibri"/>
+                <w:sz w:val="20"/>
+              </w:rPr>
+              <w:t xml:space="default">3.75</w:t>
             </w:r>
           </w:p>
         </w:tc>
@@ -3090,55 +3090,55 @@
                 <w:rFonts w:ascii="Calibri" w:hAnsi="Calibri"/>
                 <w:sz w:val="20"/>
               </w:rPr>
-              <w:t xml:space="default">-11.41</w:t>
-            </w:r>
-          </w:p>
-        </w:tc>
-        <w:tc>
-          <w:tcPr>
-            <w:tcBorders>
-              <w:top w:val="single" w:space="0" w:color="D3D3D3"/>
-              <w:bottom w:val="single" w:space="0" w:color="D3D3D3"/>
-              <w:start w:val="single" w:space="0" w:color="D3D3D3"/>
-              <w:end w:val="single" w:space="0" w:color="D3D3D3"/>
-            </w:tcBorders>
-          </w:tcPr>
-          <w:p>
-            <w:pPr>
-              <w:spacing w:before="0" w:after="60"/>
-              <w:keepNext/>
-              <w:jc w:val="end"/>
-            </w:pPr>
-            <w:r>
-              <w:rPr>
-                <w:rFonts w:ascii="Calibri" w:hAnsi="Calibri"/>
-                <w:sz w:val="20"/>
-              </w:rPr>
-              <w:t xml:space="default">4.63</w:t>
-            </w:r>
-          </w:p>
-        </w:tc>
-        <w:tc>
-          <w:tcPr>
-            <w:tcBorders>
-              <w:top w:val="single" w:space="0" w:color="D3D3D3"/>
-              <w:bottom w:val="single" w:space="0" w:color="D3D3D3"/>
-              <w:start w:val="single" w:space="0" w:color="D3D3D3"/>
-              <w:end w:val="single" w:space="0" w:color="D3D3D3"/>
-            </w:tcBorders>
-          </w:tcPr>
-          <w:p>
-            <w:pPr>
-              <w:spacing w:before="0" w:after="60"/>
-              <w:keepNext/>
-              <w:jc w:val="end"/>
-            </w:pPr>
-            <w:r>
-              <w:rPr>
-                <w:rFonts w:ascii="Calibri" w:hAnsi="Calibri"/>
-                <w:sz w:val="20"/>
-              </w:rPr>
-              <w:t xml:space="default">0.014</w:t>
+              <w:t xml:space="default">-11.44</w:t>
+            </w:r>
+          </w:p>
+        </w:tc>
+        <w:tc>
+          <w:tcPr>
+            <w:tcBorders>
+              <w:top w:val="single" w:space="0" w:color="D3D3D3"/>
+              <w:bottom w:val="single" w:space="0" w:color="D3D3D3"/>
+              <w:start w:val="single" w:space="0" w:color="D3D3D3"/>
+              <w:end w:val="single" w:space="0" w:color="D3D3D3"/>
+            </w:tcBorders>
+          </w:tcPr>
+          <w:p>
+            <w:pPr>
+              <w:spacing w:before="0" w:after="60"/>
+              <w:keepNext/>
+              <w:jc w:val="end"/>
+            </w:pPr>
+            <w:r>
+              <w:rPr>
+                <w:rFonts w:ascii="Calibri" w:hAnsi="Calibri"/>
+                <w:sz w:val="20"/>
+              </w:rPr>
+              <w:t xml:space="default">4.70</w:t>
+            </w:r>
+          </w:p>
+        </w:tc>
+        <w:tc>
+          <w:tcPr>
+            <w:tcBorders>
+              <w:top w:val="single" w:space="0" w:color="D3D3D3"/>
+              <w:bottom w:val="single" w:space="0" w:color="D3D3D3"/>
+              <w:start w:val="single" w:space="0" w:color="D3D3D3"/>
+              <w:end w:val="single" w:space="0" w:color="D3D3D3"/>
+            </w:tcBorders>
+          </w:tcPr>
+          <w:p>
+            <w:pPr>
+              <w:spacing w:before="0" w:after="60"/>
+              <w:keepNext/>
+              <w:jc w:val="end"/>
+            </w:pPr>
+            <w:r>
+              <w:rPr>
+                <w:rFonts w:ascii="Calibri" w:hAnsi="Calibri"/>
+                <w:sz w:val="20"/>
+              </w:rPr>
+              <w:t xml:space="default">0.015</w:t>
             </w:r>
           </w:p>
         </w:tc>
@@ -3240,31 +3240,31 @@
                 <w:rFonts w:ascii="Calibri" w:hAnsi="Calibri"/>
                 <w:sz w:val="20"/>
               </w:rPr>
-              <w:t xml:space="default">-11.65</w:t>
-            </w:r>
-          </w:p>
-        </w:tc>
-        <w:tc>
-          <w:tcPr>
-            <w:tcBorders>
-              <w:top w:val="single" w:space="0" w:color="D3D3D3"/>
-              <w:bottom w:val="single" w:space="0" w:color="D3D3D3"/>
-              <w:start w:val="single" w:space="0" w:color="D3D3D3"/>
-              <w:end w:val="single" w:space="0" w:color="D3D3D3"/>
-            </w:tcBorders>
-          </w:tcPr>
-          <w:p>
-            <w:pPr>
-              <w:spacing w:before="0" w:after="60"/>
-              <w:keepNext/>
-              <w:jc w:val="end"/>
-            </w:pPr>
-            <w:r>
-              <w:rPr>
-                <w:rFonts w:ascii="Calibri" w:hAnsi="Calibri"/>
-                <w:sz w:val="20"/>
-              </w:rPr>
-              <w:t xml:space="default">4.38</w:t>
+              <w:t xml:space="default">-11.67</w:t>
+            </w:r>
+          </w:p>
+        </w:tc>
+        <w:tc>
+          <w:tcPr>
+            <w:tcBorders>
+              <w:top w:val="single" w:space="0" w:color="D3D3D3"/>
+              <w:bottom w:val="single" w:space="0" w:color="D3D3D3"/>
+              <w:start w:val="single" w:space="0" w:color="D3D3D3"/>
+              <w:end w:val="single" w:space="0" w:color="D3D3D3"/>
+            </w:tcBorders>
+          </w:tcPr>
+          <w:p>
+            <w:pPr>
+              <w:spacing w:before="0" w:after="60"/>
+              <w:keepNext/>
+              <w:jc w:val="end"/>
+            </w:pPr>
+            <w:r>
+              <w:rPr>
+                <w:rFonts w:ascii="Calibri" w:hAnsi="Calibri"/>
+                <w:sz w:val="20"/>
+              </w:rPr>
+              <w:t xml:space="default">4.43</w:t>
             </w:r>
           </w:p>
         </w:tc>
@@ -3390,55 +3390,55 @@
                 <w:rFonts w:ascii="Calibri" w:hAnsi="Calibri"/>
                 <w:sz w:val="20"/>
               </w:rPr>
-              <w:t xml:space="default">-21.68</w:t>
-            </w:r>
-          </w:p>
-        </w:tc>
-        <w:tc>
-          <w:tcPr>
-            <w:tcBorders>
-              <w:top w:val="single" w:space="0" w:color="D3D3D3"/>
-              <w:bottom w:val="single" w:space="0" w:color="D3D3D3"/>
-              <w:start w:val="single" w:space="0" w:color="D3D3D3"/>
-              <w:end w:val="single" w:space="0" w:color="D3D3D3"/>
-            </w:tcBorders>
-          </w:tcPr>
-          <w:p>
-            <w:pPr>
-              <w:spacing w:before="0" w:after="60"/>
-              <w:keepNext/>
-              <w:jc w:val="end"/>
-            </w:pPr>
-            <w:r>
-              <w:rPr>
-                <w:rFonts w:ascii="Calibri" w:hAnsi="Calibri"/>
-                <w:sz w:val="20"/>
-              </w:rPr>
-              <w:t xml:space="default">8.16</w:t>
-            </w:r>
-          </w:p>
-        </w:tc>
-        <w:tc>
-          <w:tcPr>
-            <w:tcBorders>
-              <w:top w:val="single" w:space="0" w:color="D3D3D3"/>
-              <w:bottom w:val="single" w:space="0" w:color="D3D3D3"/>
-              <w:start w:val="single" w:space="0" w:color="D3D3D3"/>
-              <w:end w:val="single" w:space="0" w:color="D3D3D3"/>
-            </w:tcBorders>
-          </w:tcPr>
-          <w:p>
-            <w:pPr>
-              <w:spacing w:before="0" w:after="60"/>
-              <w:keepNext/>
-              <w:jc w:val="end"/>
-            </w:pPr>
-            <w:r>
-              <w:rPr>
-                <w:rFonts w:ascii="Calibri" w:hAnsi="Calibri"/>
-                <w:sz w:val="20"/>
-              </w:rPr>
-              <w:t xml:space="default">0.008</w:t>
+              <w:t xml:space="default">-4.27</w:t>
+            </w:r>
+          </w:p>
+        </w:tc>
+        <w:tc>
+          <w:tcPr>
+            <w:tcBorders>
+              <w:top w:val="single" w:space="0" w:color="D3D3D3"/>
+              <w:bottom w:val="single" w:space="0" w:color="D3D3D3"/>
+              <w:start w:val="single" w:space="0" w:color="D3D3D3"/>
+              <w:end w:val="single" w:space="0" w:color="D3D3D3"/>
+            </w:tcBorders>
+          </w:tcPr>
+          <w:p>
+            <w:pPr>
+              <w:spacing w:before="0" w:after="60"/>
+              <w:keepNext/>
+              <w:jc w:val="end"/>
+            </w:pPr>
+            <w:r>
+              <w:rPr>
+                <w:rFonts w:ascii="Calibri" w:hAnsi="Calibri"/>
+                <w:sz w:val="20"/>
+              </w:rPr>
+              <w:t xml:space="default">1.65</w:t>
+            </w:r>
+          </w:p>
+        </w:tc>
+        <w:tc>
+          <w:tcPr>
+            <w:tcBorders>
+              <w:top w:val="single" w:space="0" w:color="D3D3D3"/>
+              <w:bottom w:val="single" w:space="0" w:color="D3D3D3"/>
+              <w:start w:val="single" w:space="0" w:color="D3D3D3"/>
+              <w:end w:val="single" w:space="0" w:color="D3D3D3"/>
+            </w:tcBorders>
+          </w:tcPr>
+          <w:p>
+            <w:pPr>
+              <w:spacing w:before="0" w:after="60"/>
+              <w:keepNext/>
+              <w:jc w:val="end"/>
+            </w:pPr>
+            <w:r>
+              <w:rPr>
+                <w:rFonts w:ascii="Calibri" w:hAnsi="Calibri"/>
+                <w:sz w:val="20"/>
+              </w:rPr>
+              <w:t xml:space="default">0.010</w:t>
             </w:r>
           </w:p>
         </w:tc>
@@ -3540,55 +3540,55 @@
                 <w:rFonts w:ascii="Calibri" w:hAnsi="Calibri"/>
                 <w:sz w:val="20"/>
               </w:rPr>
-              <w:t xml:space="default">-12.96</w:t>
-            </w:r>
-          </w:p>
-        </w:tc>
-        <w:tc>
-          <w:tcPr>
-            <w:tcBorders>
-              <w:top w:val="single" w:space="0" w:color="D3D3D3"/>
-              <w:bottom w:val="single" w:space="0" w:color="D3D3D3"/>
-              <w:start w:val="single" w:space="0" w:color="D3D3D3"/>
-              <w:end w:val="single" w:space="0" w:color="D3D3D3"/>
-            </w:tcBorders>
-          </w:tcPr>
-          <w:p>
-            <w:pPr>
-              <w:spacing w:before="0" w:after="60"/>
-              <w:keepNext/>
-              <w:jc w:val="end"/>
-            </w:pPr>
-            <w:r>
-              <w:rPr>
-                <w:rFonts w:ascii="Calibri" w:hAnsi="Calibri"/>
-                <w:sz w:val="20"/>
-              </w:rPr>
-              <w:t xml:space="default">5.20</w:t>
-            </w:r>
-          </w:p>
-        </w:tc>
-        <w:tc>
-          <w:tcPr>
-            <w:tcBorders>
-              <w:top w:val="single" w:space="0" w:color="D3D3D3"/>
-              <w:bottom w:val="single" w:space="0" w:color="D3D3D3"/>
-              <w:start w:val="single" w:space="0" w:color="D3D3D3"/>
-              <w:end w:val="single" w:space="0" w:color="D3D3D3"/>
-            </w:tcBorders>
-          </w:tcPr>
-          <w:p>
-            <w:pPr>
-              <w:spacing w:before="0" w:after="60"/>
-              <w:keepNext/>
-              <w:jc w:val="end"/>
-            </w:pPr>
-            <w:r>
-              <w:rPr>
-                <w:rFonts w:ascii="Calibri" w:hAnsi="Calibri"/>
-                <w:sz w:val="20"/>
-              </w:rPr>
-              <w:t xml:space="default">0.013</w:t>
+              <w:t xml:space="default">-2.45</w:t>
+            </w:r>
+          </w:p>
+        </w:tc>
+        <w:tc>
+          <w:tcPr>
+            <w:tcBorders>
+              <w:top w:val="single" w:space="0" w:color="D3D3D3"/>
+              <w:bottom w:val="single" w:space="0" w:color="D3D3D3"/>
+              <w:start w:val="single" w:space="0" w:color="D3D3D3"/>
+              <w:end w:val="single" w:space="0" w:color="D3D3D3"/>
+            </w:tcBorders>
+          </w:tcPr>
+          <w:p>
+            <w:pPr>
+              <w:spacing w:before="0" w:after="60"/>
+              <w:keepNext/>
+              <w:jc w:val="end"/>
+            </w:pPr>
+            <w:r>
+              <w:rPr>
+                <w:rFonts w:ascii="Calibri" w:hAnsi="Calibri"/>
+                <w:sz w:val="20"/>
+              </w:rPr>
+              <w:t xml:space="default">1.04</w:t>
+            </w:r>
+          </w:p>
+        </w:tc>
+        <w:tc>
+          <w:tcPr>
+            <w:tcBorders>
+              <w:top w:val="single" w:space="0" w:color="D3D3D3"/>
+              <w:bottom w:val="single" w:space="0" w:color="D3D3D3"/>
+              <w:start w:val="single" w:space="0" w:color="D3D3D3"/>
+              <w:end w:val="single" w:space="0" w:color="D3D3D3"/>
+            </w:tcBorders>
+          </w:tcPr>
+          <w:p>
+            <w:pPr>
+              <w:spacing w:before="0" w:after="60"/>
+              <w:keepNext/>
+              <w:jc w:val="end"/>
+            </w:pPr>
+            <w:r>
+              <w:rPr>
+                <w:rFonts w:ascii="Calibri" w:hAnsi="Calibri"/>
+                <w:sz w:val="20"/>
+              </w:rPr>
+              <w:t xml:space="default">0.018</w:t>
             </w:r>
           </w:p>
         </w:tc>
@@ -3690,55 +3690,55 @@
                 <w:rFonts w:ascii="Calibri" w:hAnsi="Calibri"/>
                 <w:sz w:val="20"/>
               </w:rPr>
-              <w:t xml:space="default">-2.04</w:t>
-            </w:r>
-          </w:p>
-        </w:tc>
-        <w:tc>
-          <w:tcPr>
-            <w:tcBorders>
-              <w:top w:val="single" w:space="0" w:color="D3D3D3"/>
-              <w:bottom w:val="single" w:space="0" w:color="D3D3D3"/>
-              <w:start w:val="single" w:space="0" w:color="D3D3D3"/>
-              <w:end w:val="single" w:space="0" w:color="D3D3D3"/>
-            </w:tcBorders>
-          </w:tcPr>
-          <w:p>
-            <w:pPr>
-              <w:spacing w:before="0" w:after="60"/>
-              <w:keepNext/>
-              <w:jc w:val="end"/>
-            </w:pPr>
-            <w:r>
-              <w:rPr>
-                <w:rFonts w:ascii="Calibri" w:hAnsi="Calibri"/>
-                <w:sz w:val="20"/>
-              </w:rPr>
-              <w:t xml:space="default">1.30</w:t>
-            </w:r>
-          </w:p>
-        </w:tc>
-        <w:tc>
-          <w:tcPr>
-            <w:tcBorders>
-              <w:top w:val="single" w:space="0" w:color="D3D3D3"/>
-              <w:bottom w:val="single" w:space="0" w:color="D3D3D3"/>
-              <w:start w:val="single" w:space="0" w:color="D3D3D3"/>
-              <w:end w:val="single" w:space="0" w:color="D3D3D3"/>
-            </w:tcBorders>
-          </w:tcPr>
-          <w:p>
-            <w:pPr>
-              <w:spacing w:before="0" w:after="60"/>
-              <w:keepNext/>
-              <w:jc w:val="end"/>
-            </w:pPr>
-            <w:r>
-              <w:rPr>
-                <w:rFonts w:ascii="Calibri" w:hAnsi="Calibri"/>
-                <w:sz w:val="20"/>
-              </w:rPr>
-              <w:t xml:space="default">0.117</w:t>
+              <w:t xml:space="default">-0.35</w:t>
+            </w:r>
+          </w:p>
+        </w:tc>
+        <w:tc>
+          <w:tcPr>
+            <w:tcBorders>
+              <w:top w:val="single" w:space="0" w:color="D3D3D3"/>
+              <w:bottom w:val="single" w:space="0" w:color="D3D3D3"/>
+              <w:start w:val="single" w:space="0" w:color="D3D3D3"/>
+              <w:end w:val="single" w:space="0" w:color="D3D3D3"/>
+            </w:tcBorders>
+          </w:tcPr>
+          <w:p>
+            <w:pPr>
+              <w:spacing w:before="0" w:after="60"/>
+              <w:keepNext/>
+              <w:jc w:val="end"/>
+            </w:pPr>
+            <w:r>
+              <w:rPr>
+                <w:rFonts w:ascii="Calibri" w:hAnsi="Calibri"/>
+                <w:sz w:val="20"/>
+              </w:rPr>
+              <w:t xml:space="default">0.27</w:t>
+            </w:r>
+          </w:p>
+        </w:tc>
+        <w:tc>
+          <w:tcPr>
+            <w:tcBorders>
+              <w:top w:val="single" w:space="0" w:color="D3D3D3"/>
+              <w:bottom w:val="single" w:space="0" w:color="D3D3D3"/>
+              <w:start w:val="single" w:space="0" w:color="D3D3D3"/>
+              <w:end w:val="single" w:space="0" w:color="D3D3D3"/>
+            </w:tcBorders>
+          </w:tcPr>
+          <w:p>
+            <w:pPr>
+              <w:spacing w:before="0" w:after="60"/>
+              <w:keepNext/>
+              <w:jc w:val="end"/>
+            </w:pPr>
+            <w:r>
+              <w:rPr>
+                <w:rFonts w:ascii="Calibri" w:hAnsi="Calibri"/>
+                <w:sz w:val="20"/>
+              </w:rPr>
+              <w:t xml:space="default">0.193</w:t>
             </w:r>
           </w:p>
         </w:tc>
@@ -3839,55 +3839,55 @@
                 <w:rFonts w:ascii="Calibri" w:hAnsi="Calibri"/>
                 <w:sz w:val="20"/>
               </w:rPr>
-              <w:t xml:space="default">-3.69</w:t>
-            </w:r>
-          </w:p>
-        </w:tc>
-        <w:tc>
-          <w:tcPr>
-            <w:tcBorders>
-              <w:top w:val="single" w:space="0" w:color="D3D3D3"/>
-              <w:bottom w:val="single" w:space="0" w:color="D3D3D3"/>
-              <w:start w:val="single" w:space="0" w:color="D3D3D3"/>
-              <w:end w:val="single" w:space="0" w:color="D3D3D3"/>
-            </w:tcBorders>
-          </w:tcPr>
-          <w:p>
-            <w:pPr>
-              <w:spacing w:before="0" w:after="60"/>
-              <w:keepNext/>
-              <w:jc w:val="end"/>
-            </w:pPr>
-            <w:r>
-              <w:rPr>
-                <w:rFonts w:ascii="Calibri" w:hAnsi="Calibri"/>
-                <w:sz w:val="20"/>
-              </w:rPr>
-              <w:t xml:space="default">2.94</w:t>
-            </w:r>
-          </w:p>
-        </w:tc>
-        <w:tc>
-          <w:tcPr>
-            <w:tcBorders>
-              <w:top w:val="single" w:space="0" w:color="D3D3D3"/>
-              <w:bottom w:val="single" w:space="0" w:color="D3D3D3"/>
-              <w:start w:val="single" w:space="0" w:color="D3D3D3"/>
-              <w:end w:val="single" w:space="0" w:color="D3D3D3"/>
-            </w:tcBorders>
-          </w:tcPr>
-          <w:p>
-            <w:pPr>
-              <w:spacing w:before="0" w:after="60"/>
-              <w:keepNext/>
-              <w:jc w:val="end"/>
-            </w:pPr>
-            <w:r>
-              <w:rPr>
-                <w:rFonts w:ascii="Calibri" w:hAnsi="Calibri"/>
-                <w:sz w:val="20"/>
-              </w:rPr>
-              <w:t xml:space="default">0.209</w:t>
+              <w:t xml:space="default">-0.38</w:t>
+            </w:r>
+          </w:p>
+        </w:tc>
+        <w:tc>
+          <w:tcPr>
+            <w:tcBorders>
+              <w:top w:val="single" w:space="0" w:color="D3D3D3"/>
+              <w:bottom w:val="single" w:space="0" w:color="D3D3D3"/>
+              <w:start w:val="single" w:space="0" w:color="D3D3D3"/>
+              <w:end w:val="single" w:space="0" w:color="D3D3D3"/>
+            </w:tcBorders>
+          </w:tcPr>
+          <w:p>
+            <w:pPr>
+              <w:spacing w:before="0" w:after="60"/>
+              <w:keepNext/>
+              <w:jc w:val="end"/>
+            </w:pPr>
+            <w:r>
+              <w:rPr>
+                <w:rFonts w:ascii="Calibri" w:hAnsi="Calibri"/>
+                <w:sz w:val="20"/>
+              </w:rPr>
+              <w:t xml:space="default">0.65</w:t>
+            </w:r>
+          </w:p>
+        </w:tc>
+        <w:tc>
+          <w:tcPr>
+            <w:tcBorders>
+              <w:top w:val="single" w:space="0" w:color="D3D3D3"/>
+              <w:bottom w:val="single" w:space="0" w:color="D3D3D3"/>
+              <w:start w:val="single" w:space="0" w:color="D3D3D3"/>
+              <w:end w:val="single" w:space="0" w:color="D3D3D3"/>
+            </w:tcBorders>
+          </w:tcPr>
+          <w:p>
+            <w:pPr>
+              <w:spacing w:before="0" w:after="60"/>
+              <w:keepNext/>
+              <w:jc w:val="end"/>
+            </w:pPr>
+            <w:r>
+              <w:rPr>
+                <w:rFonts w:ascii="Calibri" w:hAnsi="Calibri"/>
+                <w:sz w:val="20"/>
+              </w:rPr>
+              <w:t xml:space="default">0.566</w:t>
             </w:r>
           </w:p>
         </w:tc>

</xml_diff>